<commit_message>
feat: atualizando lista 06
</commit_message>
<xml_diff>
--- a/lista/lista_t/06/06.mc_lista_ex_t_tabela_v.docx
+++ b/lista/lista_t/06/06.mc_lista_ex_t_tabela_v.docx
@@ -237,7 +237,23 @@
           <w:sz w:val="36"/>
           <w:szCs w:val="36"/>
         </w:rPr>
-        <w:t xml:space="preserve"> indica se a bateria principal está operando normalmente (</w:t>
+        <w:t xml:space="preserve"> indica se a bateria principal está operando normalmente </w:t>
+      </w:r>
+      <w:r>
+        <w:rPr>
+          <w:rFonts w:ascii="Roboto" w:hAnsi="Roboto"/>
+          <w:sz w:val="36"/>
+          <w:szCs w:val="36"/>
+        </w:rPr>
+        <w:br/>
+      </w:r>
+      <w:r>
+        <w:rPr>
+          <w:rFonts w:ascii="Roboto" w:hAnsi="Roboto"/>
+          <w:sz w:val="36"/>
+          <w:szCs w:val="36"/>
+        </w:rPr>
+        <w:t>(</w:t>
       </w:r>
       <m:oMath>
         <m:r>
@@ -426,7 +442,29 @@
           <w:sz w:val="36"/>
           <w:szCs w:val="36"/>
         </w:rPr>
-        <w:t>Exercício 2: O Operador bitwise NOT</w:t>
+        <w:t xml:space="preserve">Exercício 2: O Operador </w:t>
+      </w:r>
+      <w:proofErr w:type="spellStart"/>
+      <w:r>
+        <w:rPr>
+          <w:rFonts w:ascii="Roboto" w:hAnsi="Roboto"/>
+          <w:b/>
+          <w:bCs/>
+          <w:sz w:val="36"/>
+          <w:szCs w:val="36"/>
+        </w:rPr>
+        <w:t>bitwise</w:t>
+      </w:r>
+      <w:proofErr w:type="spellEnd"/>
+      <w:r>
+        <w:rPr>
+          <w:rFonts w:ascii="Roboto" w:hAnsi="Roboto"/>
+          <w:b/>
+          <w:bCs/>
+          <w:sz w:val="36"/>
+          <w:szCs w:val="36"/>
+        </w:rPr>
+        <w:t xml:space="preserve"> NOT</w:t>
       </w:r>
     </w:p>
     <w:p>
@@ -443,7 +481,27 @@
           <w:sz w:val="36"/>
           <w:szCs w:val="36"/>
         </w:rPr>
-        <w:t>Na linguagem C ou Python, o operador de negação bitwise inverte todos os bits de uma variável lógica.</w:t>
+        <w:t xml:space="preserve">Na linguagem C ou Python, o operador de negação </w:t>
+      </w:r>
+      <w:proofErr w:type="spellStart"/>
+      <w:r>
+        <w:rPr>
+          <w:rFonts w:ascii="Roboto" w:hAnsi="Roboto"/>
+          <w:i/>
+          <w:iCs/>
+          <w:sz w:val="36"/>
+          <w:szCs w:val="36"/>
+        </w:rPr>
+        <w:t>bitwise</w:t>
+      </w:r>
+      <w:proofErr w:type="spellEnd"/>
+      <w:r>
+        <w:rPr>
+          <w:rFonts w:ascii="Roboto" w:hAnsi="Roboto"/>
+          <w:sz w:val="36"/>
+          <w:szCs w:val="36"/>
+        </w:rPr>
+        <w:t xml:space="preserve"> inverte todos os bits de uma variável lógica.</w:t>
       </w:r>
     </w:p>
     <w:p>
@@ -479,7 +537,23 @@
           <w:sz w:val="36"/>
           <w:szCs w:val="36"/>
         </w:rPr>
-        <w:t xml:space="preserve">. Monte a tabela verdade para as expressões </w:t>
+        <w:t xml:space="preserve">. </w:t>
+      </w:r>
+      <w:r>
+        <w:rPr>
+          <w:rFonts w:ascii="Roboto" w:hAnsi="Roboto"/>
+          <w:sz w:val="36"/>
+          <w:szCs w:val="36"/>
+        </w:rPr>
+        <w:br/>
+      </w:r>
+      <w:r>
+        <w:rPr>
+          <w:rFonts w:ascii="Roboto" w:hAnsi="Roboto"/>
+          <w:sz w:val="36"/>
+          <w:szCs w:val="36"/>
+        </w:rPr>
+        <w:t xml:space="preserve">Monte a tabela verdade para as expressões </w:t>
       </w:r>
       <m:oMath>
         <m:r>
@@ -515,7 +589,23 @@
           <w:sz w:val="36"/>
           <w:szCs w:val="36"/>
         </w:rPr>
-        <w:t>. O que acontece com a tabela se aplicarmos a negação sobre um valor booleano já invertido?</w:t>
+        <w:t xml:space="preserve">. </w:t>
+      </w:r>
+      <w:r>
+        <w:rPr>
+          <w:rFonts w:ascii="Roboto" w:hAnsi="Roboto"/>
+          <w:sz w:val="36"/>
+          <w:szCs w:val="36"/>
+        </w:rPr>
+        <w:br/>
+      </w:r>
+      <w:r>
+        <w:rPr>
+          <w:rFonts w:ascii="Roboto" w:hAnsi="Roboto"/>
+          <w:sz w:val="36"/>
+          <w:szCs w:val="36"/>
+        </w:rPr>
+        <w:t>O que acontece com a tabela se aplicarmos a negação sobre um valor booleano já invertido?</w:t>
       </w:r>
     </w:p>
     <w:p>
@@ -626,7 +716,23 @@
           <w:sz w:val="36"/>
           <w:szCs w:val="36"/>
         </w:rPr>
-        <w:t xml:space="preserve">Construa uma tabela verdade completa com as colunas </w:t>
+        <w:t xml:space="preserve">Construa uma tabela verdade completa com as </w:t>
+      </w:r>
+      <w:r>
+        <w:rPr>
+          <w:rFonts w:ascii="Roboto" w:hAnsi="Roboto"/>
+          <w:sz w:val="36"/>
+          <w:szCs w:val="36"/>
+        </w:rPr>
+        <w:br/>
+      </w:r>
+      <w:r>
+        <w:rPr>
+          <w:rFonts w:ascii="Roboto" w:hAnsi="Roboto"/>
+          <w:sz w:val="36"/>
+          <w:szCs w:val="36"/>
+        </w:rPr>
+        <w:t xml:space="preserve">colunas </w:t>
       </w:r>
       <m:oMath>
         <m:r>
@@ -967,7 +1073,9 @@
           <w:szCs w:val="36"/>
         </w:rPr>
       </w:pPr>
-      <w:r>
+    </w:p>
+    <w:p>
+      <w:pPr>
         <w:rPr>
           <w:rFonts w:ascii="Roboto" w:hAnsi="Roboto"/>
           <w:b/>
@@ -975,25 +1083,41 @@
           <w:sz w:val="36"/>
           <w:szCs w:val="36"/>
         </w:rPr>
-        <w:t>Exercício 5: Refatoração de Condicional if</w:t>
-      </w:r>
+      </w:pPr>
     </w:p>
     <w:p>
       <w:pPr>
         <w:rPr>
           <w:rFonts w:ascii="Roboto" w:hAnsi="Roboto"/>
-          <w:sz w:val="36"/>
-          <w:szCs w:val="36"/>
-        </w:rPr>
-      </w:pPr>
-      <w:r>
-        <w:rPr>
-          <w:rFonts w:ascii="Roboto" w:hAnsi="Roboto"/>
-          <w:sz w:val="36"/>
-          <w:szCs w:val="36"/>
-        </w:rPr>
-        <w:t>Um programador escreveu a seguinte condição em um sistema de segurança de acesso: if not (not usuario_autenticado):.</w:t>
-      </w:r>
+          <w:b/>
+          <w:bCs/>
+          <w:sz w:val="36"/>
+          <w:szCs w:val="36"/>
+        </w:rPr>
+      </w:pPr>
+      <w:r>
+        <w:rPr>
+          <w:rFonts w:ascii="Roboto" w:hAnsi="Roboto"/>
+          <w:b/>
+          <w:bCs/>
+          <w:sz w:val="36"/>
+          <w:szCs w:val="36"/>
+        </w:rPr>
+        <w:lastRenderedPageBreak/>
+        <w:t xml:space="preserve">Exercício 5: Refatoração de Condicional </w:t>
+      </w:r>
+      <w:proofErr w:type="spellStart"/>
+      <w:r>
+        <w:rPr>
+          <w:rFonts w:ascii="Roboto" w:hAnsi="Roboto"/>
+          <w:b/>
+          <w:bCs/>
+          <w:sz w:val="36"/>
+          <w:szCs w:val="36"/>
+        </w:rPr>
+        <w:t>if</w:t>
+      </w:r>
+      <w:proofErr w:type="spellEnd"/>
     </w:p>
     <w:p>
       <w:pPr>
@@ -1009,7 +1133,105 @@
           <w:sz w:val="36"/>
           <w:szCs w:val="36"/>
         </w:rPr>
-        <w:lastRenderedPageBreak/>
+        <w:t xml:space="preserve">Um programador escreveu a seguinte condição em um sistema de segurança de acesso: </w:t>
+      </w:r>
+      <w:r>
+        <w:rPr>
+          <w:rFonts w:ascii="Roboto" w:hAnsi="Roboto"/>
+          <w:sz w:val="36"/>
+          <w:szCs w:val="36"/>
+        </w:rPr>
+        <w:br/>
+      </w:r>
+      <w:proofErr w:type="spellStart"/>
+      <w:r>
+        <w:rPr>
+          <w:rFonts w:ascii="Roboto" w:hAnsi="Roboto"/>
+          <w:sz w:val="36"/>
+          <w:szCs w:val="36"/>
+        </w:rPr>
+        <w:t>if</w:t>
+      </w:r>
+      <w:proofErr w:type="spellEnd"/>
+      <w:r>
+        <w:rPr>
+          <w:rFonts w:ascii="Roboto" w:hAnsi="Roboto"/>
+          <w:sz w:val="36"/>
+          <w:szCs w:val="36"/>
+        </w:rPr>
+        <w:t xml:space="preserve"> </w:t>
+      </w:r>
+      <w:proofErr w:type="spellStart"/>
+      <w:r>
+        <w:rPr>
+          <w:rFonts w:ascii="Roboto" w:hAnsi="Roboto"/>
+          <w:sz w:val="36"/>
+          <w:szCs w:val="36"/>
+        </w:rPr>
+        <w:t>not</w:t>
+      </w:r>
+      <w:proofErr w:type="spellEnd"/>
+      <w:r>
+        <w:rPr>
+          <w:rFonts w:ascii="Roboto" w:hAnsi="Roboto"/>
+          <w:sz w:val="36"/>
+          <w:szCs w:val="36"/>
+        </w:rPr>
+        <w:t xml:space="preserve"> (</w:t>
+      </w:r>
+      <w:proofErr w:type="spellStart"/>
+      <w:r>
+        <w:rPr>
+          <w:rFonts w:ascii="Roboto" w:hAnsi="Roboto"/>
+          <w:sz w:val="36"/>
+          <w:szCs w:val="36"/>
+        </w:rPr>
+        <w:t>not</w:t>
+      </w:r>
+      <w:proofErr w:type="spellEnd"/>
+      <w:r>
+        <w:rPr>
+          <w:rFonts w:ascii="Roboto" w:hAnsi="Roboto"/>
+          <w:sz w:val="36"/>
+          <w:szCs w:val="36"/>
+        </w:rPr>
+        <w:t xml:space="preserve"> </w:t>
+      </w:r>
+      <w:proofErr w:type="spellStart"/>
+      <w:r>
+        <w:rPr>
+          <w:rFonts w:ascii="Roboto" w:hAnsi="Roboto"/>
+          <w:sz w:val="36"/>
+          <w:szCs w:val="36"/>
+        </w:rPr>
+        <w:t>usuario_autenticado</w:t>
+      </w:r>
+      <w:proofErr w:type="spellEnd"/>
+      <w:proofErr w:type="gramStart"/>
+      <w:r>
+        <w:rPr>
+          <w:rFonts w:ascii="Roboto" w:hAnsi="Roboto"/>
+          <w:sz w:val="36"/>
+          <w:szCs w:val="36"/>
+        </w:rPr>
+        <w:t>):.</w:t>
+      </w:r>
+      <w:proofErr w:type="gramEnd"/>
+    </w:p>
+    <w:p>
+      <w:pPr>
+        <w:rPr>
+          <w:rFonts w:ascii="Roboto" w:hAnsi="Roboto"/>
+          <w:sz w:val="36"/>
+          <w:szCs w:val="36"/>
+        </w:rPr>
+      </w:pPr>
+      <w:r>
+        <w:rPr>
+          <w:rFonts w:ascii="Roboto" w:hAnsi="Roboto"/>
+          <w:sz w:val="36"/>
+          <w:szCs w:val="36"/>
+        </w:rPr>
         <w:t xml:space="preserve">Sendo </w:t>
       </w:r>
       <m:oMath>
@@ -1349,6 +1571,7 @@
           <w:sz w:val="36"/>
           <w:szCs w:val="36"/>
         </w:rPr>
+        <w:lastRenderedPageBreak/>
         <w:t xml:space="preserve">Construa a tabela verdade para a proposição </w:t>
       </w:r>
       <m:oMath>
@@ -1367,13 +1590,56 @@
           <w:sz w:val="36"/>
           <w:szCs w:val="36"/>
         </w:rPr>
-        <w:t>. Analise a coluna final e explique por que esse resultado é crítico para evitar "deadlocks" ou estados impossíveis em sistemas.</w:t>
+        <w:t xml:space="preserve">. </w:t>
+      </w:r>
+      <w:r>
+        <w:rPr>
+          <w:rFonts w:ascii="Roboto" w:hAnsi="Roboto"/>
+          <w:sz w:val="36"/>
+          <w:szCs w:val="36"/>
+        </w:rPr>
+        <w:br/>
+      </w:r>
+      <w:r>
+        <w:rPr>
+          <w:rFonts w:ascii="Roboto" w:hAnsi="Roboto"/>
+          <w:sz w:val="36"/>
+          <w:szCs w:val="36"/>
+        </w:rPr>
+        <w:t>Analise a coluna final e explique por que esse resultado é crítico para evitar "</w:t>
+      </w:r>
+      <w:r>
+        <w:rPr>
+          <w:rFonts w:ascii="Roboto" w:hAnsi="Roboto"/>
+          <w:i/>
+          <w:iCs/>
+          <w:sz w:val="36"/>
+          <w:szCs w:val="36"/>
+        </w:rPr>
+        <w:t>deadlocks</w:t>
+      </w:r>
+      <w:r>
+        <w:rPr>
+          <w:rFonts w:ascii="Roboto" w:hAnsi="Roboto"/>
+          <w:sz w:val="36"/>
+          <w:szCs w:val="36"/>
+        </w:rPr>
+        <w:t>" ou estados impossíveis em sistemas.</w:t>
       </w:r>
     </w:p>
     <w:p>
       <w:pPr>
         <w:rPr>
           <w:rFonts w:ascii="Roboto" w:hAnsi="Roboto"/>
+          <w:sz w:val="36"/>
+          <w:szCs w:val="36"/>
+        </w:rPr>
+      </w:pPr>
+    </w:p>
+    <w:p>
+      <w:pPr>
+        <w:rPr>
+          <w:rFonts w:ascii="Roboto" w:hAnsi="Roboto"/>
           <w:b/>
           <w:bCs/>
           <w:sz w:val="36"/>
@@ -1388,7 +1654,6 @@
           <w:sz w:val="36"/>
           <w:szCs w:val="36"/>
         </w:rPr>
-        <w:lastRenderedPageBreak/>
         <w:t>Exercício 8: Identificando Tautologias (Princípio do Terceiro Excluído)</w:t>
       </w:r>
     </w:p>
@@ -1459,7 +1724,23 @@
           <w:sz w:val="36"/>
           <w:szCs w:val="36"/>
         </w:rPr>
-        <w:t xml:space="preserve"> (todos os valores iguais a 1/Verdadeiro).</w:t>
+        <w:t xml:space="preserve"> </w:t>
+      </w:r>
+      <w:r>
+        <w:rPr>
+          <w:rFonts w:ascii="Roboto" w:hAnsi="Roboto"/>
+          <w:sz w:val="36"/>
+          <w:szCs w:val="36"/>
+        </w:rPr>
+        <w:br/>
+      </w:r>
+      <w:r>
+        <w:rPr>
+          <w:rFonts w:ascii="Roboto" w:hAnsi="Roboto"/>
+          <w:sz w:val="36"/>
+          <w:szCs w:val="36"/>
+        </w:rPr>
+        <w:t>(todos os valores iguais a 1/Verdadeiro).</w:t>
       </w:r>
     </w:p>
     <w:p>
@@ -1506,7 +1787,59 @@
           <w:sz w:val="36"/>
           <w:szCs w:val="36"/>
         </w:rPr>
-        <w:t>Um banco de dados de RH usa o seguinte filtro para listar candidatos a uma vaga de desenvolvedor: exibir = not (experiencia_python).</w:t>
+        <w:t xml:space="preserve">Um banco de dados de RH usa o seguinte filtro para listar candidatos a uma vaga de desenvolvedor: </w:t>
+      </w:r>
+      <w:r>
+        <w:rPr>
+          <w:rFonts w:ascii="Roboto" w:hAnsi="Roboto"/>
+          <w:sz w:val="36"/>
+          <w:szCs w:val="36"/>
+        </w:rPr>
+        <w:br/>
+      </w:r>
+      <w:r>
+        <w:rPr>
+          <w:rFonts w:ascii="Roboto" w:hAnsi="Roboto"/>
+          <w:sz w:val="36"/>
+          <w:szCs w:val="36"/>
+        </w:rPr>
+        <w:t xml:space="preserve">exibir = </w:t>
+      </w:r>
+      <w:proofErr w:type="spellStart"/>
+      <w:r>
+        <w:rPr>
+          <w:rFonts w:ascii="Roboto" w:hAnsi="Roboto"/>
+          <w:sz w:val="36"/>
+          <w:szCs w:val="36"/>
+        </w:rPr>
+        <w:t>not</w:t>
+      </w:r>
+      <w:proofErr w:type="spellEnd"/>
+      <w:r>
+        <w:rPr>
+          <w:rFonts w:ascii="Roboto" w:hAnsi="Roboto"/>
+          <w:sz w:val="36"/>
+          <w:szCs w:val="36"/>
+        </w:rPr>
+        <w:t xml:space="preserve"> (</w:t>
+      </w:r>
+      <w:proofErr w:type="spellStart"/>
+      <w:r>
+        <w:rPr>
+          <w:rFonts w:ascii="Roboto" w:hAnsi="Roboto"/>
+          <w:sz w:val="36"/>
+          <w:szCs w:val="36"/>
+        </w:rPr>
+        <w:t>experiencia_python</w:t>
+      </w:r>
+      <w:proofErr w:type="spellEnd"/>
+      <w:r>
+        <w:rPr>
+          <w:rFonts w:ascii="Roboto" w:hAnsi="Roboto"/>
+          <w:sz w:val="36"/>
+          <w:szCs w:val="36"/>
+        </w:rPr>
+        <w:t>).</w:t>
       </w:r>
     </w:p>
     <w:p>
@@ -1541,7 +1874,23 @@
           <w:sz w:val="36"/>
           <w:szCs w:val="36"/>
         </w:rPr>
-        <w:t>: "O candidato tem experiência em Python".</w:t>
+        <w:t xml:space="preserve">: </w:t>
+      </w:r>
+      <w:r>
+        <w:rPr>
+          <w:rFonts w:ascii="Roboto" w:hAnsi="Roboto"/>
+          <w:sz w:val="36"/>
+          <w:szCs w:val="36"/>
+        </w:rPr>
+        <w:br/>
+      </w:r>
+      <w:r>
+        <w:rPr>
+          <w:rFonts w:ascii="Roboto" w:hAnsi="Roboto"/>
+          <w:sz w:val="36"/>
+          <w:szCs w:val="36"/>
+        </w:rPr>
+        <w:t>"O candidato tem experiência em Python".</w:t>
       </w:r>
     </w:p>
     <w:p>
@@ -1594,7 +1943,23 @@
           <w:sz w:val="36"/>
           <w:szCs w:val="36"/>
         </w:rPr>
-        <w:t>. Identifique para quais perfis de candidatos o sistema retornará o valor True.</w:t>
+        <w:t xml:space="preserve">. </w:t>
+      </w:r>
+      <w:r>
+        <w:rPr>
+          <w:rFonts w:ascii="Roboto" w:hAnsi="Roboto"/>
+          <w:sz w:val="36"/>
+          <w:szCs w:val="36"/>
+        </w:rPr>
+        <w:br/>
+      </w:r>
+      <w:r>
+        <w:rPr>
+          <w:rFonts w:ascii="Roboto" w:hAnsi="Roboto"/>
+          <w:sz w:val="36"/>
+          <w:szCs w:val="36"/>
+        </w:rPr>
+        <w:t>Identifique para quais perfis de candidatos o sistema retornará o valor True.</w:t>
       </w:r>
     </w:p>
     <w:p>
@@ -1618,9 +1983,7 @@
           <w:szCs w:val="36"/>
         </w:rPr>
       </w:pPr>
-    </w:p>
-    <w:p>
-      <w:pPr>
+      <w:r>
         <w:rPr>
           <w:rFonts w:ascii="Roboto" w:hAnsi="Roboto"/>
           <w:b/>
@@ -1628,49 +1991,6 @@
           <w:sz w:val="36"/>
           <w:szCs w:val="36"/>
         </w:rPr>
-      </w:pPr>
-    </w:p>
-    <w:p>
-      <w:pPr>
-        <w:rPr>
-          <w:rFonts w:ascii="Roboto" w:hAnsi="Roboto"/>
-          <w:b/>
-          <w:bCs/>
-          <w:sz w:val="36"/>
-          <w:szCs w:val="36"/>
-        </w:rPr>
-      </w:pPr>
-    </w:p>
-    <w:p>
-      <w:pPr>
-        <w:rPr>
-          <w:rFonts w:ascii="Roboto" w:hAnsi="Roboto"/>
-          <w:b/>
-          <w:bCs/>
-          <w:sz w:val="36"/>
-          <w:szCs w:val="36"/>
-        </w:rPr>
-      </w:pPr>
-    </w:p>
-    <w:p>
-      <w:pPr>
-        <w:rPr>
-          <w:rFonts w:ascii="Roboto" w:hAnsi="Roboto"/>
-          <w:b/>
-          <w:bCs/>
-          <w:sz w:val="36"/>
-          <w:szCs w:val="36"/>
-        </w:rPr>
-      </w:pPr>
-      <w:r>
-        <w:rPr>
-          <w:rFonts w:ascii="Roboto" w:hAnsi="Roboto"/>
-          <w:b/>
-          <w:bCs/>
-          <w:sz w:val="36"/>
-          <w:szCs w:val="36"/>
-        </w:rPr>
-        <w:lastRenderedPageBreak/>
         <w:t>Exercício 10: Circuitos Lógicos – A Porta NOT (Inversor)</w:t>
       </w:r>
     </w:p>
@@ -1704,8 +2024,8 @@
         <w:tblLook w:val="04A0" w:firstRow="1" w:lastRow="0" w:firstColumn="1" w:lastColumn="0" w:noHBand="0" w:noVBand="1"/>
       </w:tblPr>
       <w:tblGrid>
-        <w:gridCol w:w="2265"/>
-        <w:gridCol w:w="2537"/>
+        <w:gridCol w:w="2267"/>
+        <w:gridCol w:w="2538"/>
       </w:tblGrid>
       <w:tr>
         <w:trPr>
@@ -1952,13 +2272,38 @@
           <w:szCs w:val="36"/>
         </w:rPr>
       </w:pPr>
-      <w:r>
-        <w:rPr>
-          <w:rFonts w:ascii="Roboto" w:hAnsi="Roboto"/>
-          <w:sz w:val="36"/>
-          <w:szCs w:val="36"/>
-        </w:rPr>
-        <w:t>Suponha um circuito em série com duas portas NOT consecutivas (a saída da primeira entra na segunda). Monte a tabela verdade de entradas e saídas desse circuito (</w:t>
+    </w:p>
+    <w:p>
+      <w:pPr>
+        <w:rPr>
+          <w:rFonts w:ascii="Roboto" w:hAnsi="Roboto"/>
+          <w:sz w:val="36"/>
+          <w:szCs w:val="36"/>
+        </w:rPr>
+      </w:pPr>
+      <w:r>
+        <w:rPr>
+          <w:rFonts w:ascii="Roboto" w:hAnsi="Roboto"/>
+          <w:sz w:val="36"/>
+          <w:szCs w:val="36"/>
+        </w:rPr>
+        <w:t xml:space="preserve">Suponha um circuito em série com duas portas NOT consecutivas (a saída da primeira entra na segunda). </w:t>
+      </w:r>
+      <w:r>
+        <w:rPr>
+          <w:rFonts w:ascii="Roboto" w:hAnsi="Roboto"/>
+          <w:sz w:val="36"/>
+          <w:szCs w:val="36"/>
+        </w:rPr>
+        <w:br/>
+      </w:r>
+      <w:r>
+        <w:rPr>
+          <w:rFonts w:ascii="Roboto" w:hAnsi="Roboto"/>
+          <w:sz w:val="36"/>
+          <w:szCs w:val="36"/>
+        </w:rPr>
+        <w:t>Monte a tabela verdade de entradas e saídas desse circuito (</w:t>
       </w:r>
       <m:oMath>
         <m:r>

</xml_diff>